<commit_message>
nmv 26 05 2026
</commit_message>
<xml_diff>
--- a/TS-Kramam/TS-1.3/TS 1.3 Malayalam Krama Paatam Corrections.docx
+++ b/TS-Kramam/TS-1.3/TS 1.3 Malayalam Krama Paatam Corrections.docx
@@ -112,7 +112,27 @@
           <w:szCs w:val="32"/>
           <w:u w:val="single"/>
         </w:rPr>
-        <w:t>31st Jan 2026</w:t>
+        <w:t xml:space="preserve">31st </w:t>
+      </w:r>
+      <w:r>
+        <w:rPr>
+          <w:b/>
+          <w:bCs/>
+          <w:sz w:val="32"/>
+          <w:szCs w:val="32"/>
+          <w:u w:val="single"/>
+        </w:rPr>
+        <w:t>May</w:t>
+      </w:r>
+      <w:r>
+        <w:rPr>
+          <w:b/>
+          <w:bCs/>
+          <w:sz w:val="32"/>
+          <w:szCs w:val="32"/>
+          <w:u w:val="single"/>
+        </w:rPr>
+        <w:t xml:space="preserve"> 2026</w:t>
       </w:r>
     </w:p>
     <w:p>
@@ -1394,7 +1414,9 @@
           <w:u w:val="single"/>
         </w:rPr>
       </w:pPr>
-      <w:r>
+    </w:p>
+    <w:p>
+      <w:pPr>
         <w:rPr>
           <w:b/>
           <w:bCs/>
@@ -1402,6 +1424,27 @@
           <w:szCs w:val="32"/>
           <w:u w:val="single"/>
         </w:rPr>
+      </w:pPr>
+    </w:p>
+    <w:p>
+      <w:pPr>
+        <w:rPr>
+          <w:b/>
+          <w:bCs/>
+          <w:sz w:val="32"/>
+          <w:szCs w:val="32"/>
+          <w:u w:val="single"/>
+        </w:rPr>
+      </w:pPr>
+      <w:r>
+        <w:rPr>
+          <w:b/>
+          <w:bCs/>
+          <w:sz w:val="32"/>
+          <w:szCs w:val="32"/>
+          <w:u w:val="single"/>
+        </w:rPr>
+        <w:lastRenderedPageBreak/>
         <w:t xml:space="preserve">TS </w:t>
       </w:r>
       <w:r>
@@ -1558,7 +1601,6 @@
                 <w:sz w:val="32"/>
                 <w:szCs w:val="32"/>
               </w:rPr>
-              <w:lastRenderedPageBreak/>
               <w:t>Reference</w:t>
             </w:r>
           </w:p>
@@ -1581,7 +1623,6 @@
                 <w:sz w:val="32"/>
                 <w:szCs w:val="32"/>
               </w:rPr>
-              <w:lastRenderedPageBreak/>
               <w:t>As Printed</w:t>
             </w:r>
           </w:p>
@@ -3087,6 +3128,7 @@
           <w:szCs w:val="32"/>
           <w:u w:val="single"/>
         </w:rPr>
+        <w:lastRenderedPageBreak/>
         <w:t xml:space="preserve">TS </w:t>
       </w:r>
       <w:r>
@@ -3243,7 +3285,6 @@
                 <w:sz w:val="32"/>
                 <w:szCs w:val="32"/>
               </w:rPr>
-              <w:lastRenderedPageBreak/>
               <w:t>Reference</w:t>
             </w:r>
           </w:p>
@@ -3266,7 +3307,6 @@
                 <w:sz w:val="32"/>
                 <w:szCs w:val="32"/>
               </w:rPr>
-              <w:lastRenderedPageBreak/>
               <w:t>As Printed</w:t>
             </w:r>
           </w:p>
@@ -5113,6 +5153,7 @@
           <w:szCs w:val="32"/>
           <w:u w:val="single"/>
         </w:rPr>
+        <w:lastRenderedPageBreak/>
         <w:t xml:space="preserve">TS </w:t>
       </w:r>
       <w:r>
@@ -5297,7 +5338,6 @@
                 <w:sz w:val="32"/>
                 <w:szCs w:val="32"/>
               </w:rPr>
-              <w:lastRenderedPageBreak/>
               <w:t>Reference</w:t>
             </w:r>
           </w:p>
@@ -5320,7 +5360,6 @@
                 <w:sz w:val="32"/>
                 <w:szCs w:val="32"/>
               </w:rPr>
-              <w:lastRenderedPageBreak/>
               <w:t>As Printed</w:t>
             </w:r>
           </w:p>
@@ -7423,6 +7462,7 @@
           <w:szCs w:val="32"/>
           <w:u w:val="single"/>
         </w:rPr>
+        <w:lastRenderedPageBreak/>
         <w:t xml:space="preserve">TS </w:t>
       </w:r>
       <w:r>
@@ -7560,7 +7600,6 @@
                 <w:sz w:val="32"/>
                 <w:szCs w:val="32"/>
               </w:rPr>
-              <w:lastRenderedPageBreak/>
               <w:t>Section, Paragraph</w:t>
             </w:r>
           </w:p>

</xml_diff>